<commit_message>
docs: align documentation headings with the instructor's format
Drop section numbers so headings map one-to-one, by name and order, to the
required structure (cover, contents, overview to database design, user interface
design, feature list, summary and future work, sources). Read TOC page numbers
from the PDF outline instead of searching page text.
</commit_message>
<xml_diff>
--- a/docs/StockWise_Technical_Documentation.docx
+++ b/docs/StockWise_Technical_Documentation.docx
@@ -221,7 +221,7 @@
           </w:r>
           <w:hyperlink w:history="1" w:anchor="_Toc1">
             <w:r>
-              <w:t xml:space="preserve">1. Project Overview</w:t>
+              <w:t xml:space="preserve">Project Overview</w:t>
             </w:r>
             <w:r>
               <w:tab/>
@@ -244,7 +244,7 @@
           </w:pPr>
           <w:hyperlink w:history="1" w:anchor="_Toc2">
             <w:r>
-              <w:t xml:space="preserve">1.1 Background and Problem</w:t>
+              <w:t xml:space="preserve">Background and Problem</w:t>
             </w:r>
             <w:r>
               <w:tab/>
@@ -267,7 +267,7 @@
           </w:pPr>
           <w:hyperlink w:history="1" w:anchor="_Toc3">
             <w:r>
-              <w:t xml:space="preserve">1.2 Proposed Solution</w:t>
+              <w:t xml:space="preserve">Proposed Solution</w:t>
             </w:r>
             <w:r>
               <w:tab/>
@@ -290,7 +290,7 @@
           </w:pPr>
           <w:hyperlink w:history="1" w:anchor="_Toc4">
             <w:r>
-              <w:t xml:space="preserve">1.3 Live Deliverables</w:t>
+              <w:t xml:space="preserve">Live Deliverables</w:t>
             </w:r>
             <w:r>
               <w:tab/>
@@ -313,7 +313,7 @@
           </w:pPr>
           <w:hyperlink w:history="1" w:anchor="_Toc5">
             <w:r>
-              <w:t xml:space="preserve">2. Objectives</w:t>
+              <w:t xml:space="preserve">Objectives</w:t>
             </w:r>
             <w:r>
               <w:tab/>
@@ -336,7 +336,7 @@
           </w:pPr>
           <w:hyperlink w:history="1" w:anchor="_Toc6">
             <w:r>
-              <w:t xml:space="preserve">3. Scope and Limitations</w:t>
+              <w:t xml:space="preserve">Scope and Limitations</w:t>
             </w:r>
             <w:r>
               <w:tab/>
@@ -359,7 +359,7 @@
           </w:pPr>
           <w:hyperlink w:history="1" w:anchor="_Toc7">
             <w:r>
-              <w:t xml:space="preserve">3.1 Scope</w:t>
+              <w:t xml:space="preserve">Scope</w:t>
             </w:r>
             <w:r>
               <w:tab/>
@@ -382,7 +382,7 @@
           </w:pPr>
           <w:hyperlink w:history="1" w:anchor="_Toc8">
             <w:r>
-              <w:t xml:space="preserve">3.2 Limitations</w:t>
+              <w:t xml:space="preserve">Limitations</w:t>
             </w:r>
             <w:r>
               <w:tab/>
@@ -405,7 +405,7 @@
           </w:pPr>
           <w:hyperlink w:history="1" w:anchor="_Toc9">
             <w:r>
-              <w:t xml:space="preserve">4. System Architecture</w:t>
+              <w:t xml:space="preserve">System Architecture</w:t>
             </w:r>
             <w:r>
               <w:tab/>
@@ -428,7 +428,7 @@
           </w:pPr>
           <w:hyperlink w:history="1" w:anchor="_Toc10">
             <w:r>
-              <w:t xml:space="preserve">4.1 Presentation Tier (Client)</w:t>
+              <w:t xml:space="preserve">Presentation Tier (Client)</w:t>
             </w:r>
             <w:r>
               <w:tab/>
@@ -451,7 +451,7 @@
           </w:pPr>
           <w:hyperlink w:history="1" w:anchor="_Toc11">
             <w:r>
-              <w:t xml:space="preserve">4.2 Application Tier (REST API)</w:t>
+              <w:t xml:space="preserve">Application Tier (REST API)</w:t>
             </w:r>
             <w:r>
               <w:tab/>
@@ -474,7 +474,7 @@
           </w:pPr>
           <w:hyperlink w:history="1" w:anchor="_Toc12">
             <w:r>
-              <w:t xml:space="preserve">4.3 Data Tier (Database)</w:t>
+              <w:t xml:space="preserve">Data Tier (Database)</w:t>
             </w:r>
             <w:r>
               <w:tab/>
@@ -497,7 +497,7 @@
           </w:pPr>
           <w:hyperlink w:history="1" w:anchor="_Toc13">
             <w:r>
-              <w:t xml:space="preserve">4.4 REST and JWT Authentication Flow</w:t>
+              <w:t xml:space="preserve">REST and JWT Authentication Flow</w:t>
             </w:r>
             <w:r>
               <w:tab/>
@@ -520,7 +520,7 @@
           </w:pPr>
           <w:hyperlink w:history="1" w:anchor="_Toc14">
             <w:r>
-              <w:t xml:space="preserve">4.5 Stock Integrity</w:t>
+              <w:t xml:space="preserve">Stock Integrity</w:t>
             </w:r>
             <w:r>
               <w:tab/>
@@ -543,7 +543,7 @@
           </w:pPr>
           <w:hyperlink w:history="1" w:anchor="_Toc15">
             <w:r>
-              <w:t xml:space="preserve">5. Database Design</w:t>
+              <w:t xml:space="preserve">Database Design</w:t>
             </w:r>
             <w:r>
               <w:tab/>
@@ -566,7 +566,7 @@
           </w:pPr>
           <w:hyperlink w:history="1" w:anchor="_Toc16">
             <w:r>
-              <w:t xml:space="preserve">6. User Interface Design</w:t>
+              <w:t xml:space="preserve">User Interface Design</w:t>
             </w:r>
             <w:r>
               <w:tab/>
@@ -589,7 +589,7 @@
           </w:pPr>
           <w:hyperlink w:history="1" w:anchor="_Toc17">
             <w:r>
-              <w:t xml:space="preserve">7. Feature List</w:t>
+              <w:t xml:space="preserve">Feature List</w:t>
             </w:r>
             <w:r>
               <w:tab/>
@@ -612,7 +612,7 @@
           </w:pPr>
           <w:hyperlink w:history="1" w:anchor="_Toc18">
             <w:r>
-              <w:t xml:space="preserve">7.1 Authentication and Roles</w:t>
+              <w:t xml:space="preserve">Authentication and Roles</w:t>
             </w:r>
             <w:r>
               <w:tab/>
@@ -635,7 +635,7 @@
           </w:pPr>
           <w:hyperlink w:history="1" w:anchor="_Toc19">
             <w:r>
-              <w:t xml:space="preserve">7.2 Dashboard</w:t>
+              <w:t xml:space="preserve">Dashboard</w:t>
             </w:r>
             <w:r>
               <w:tab/>
@@ -658,7 +658,7 @@
           </w:pPr>
           <w:hyperlink w:history="1" w:anchor="_Toc20">
             <w:r>
-              <w:t xml:space="preserve">7.3 Products</w:t>
+              <w:t xml:space="preserve">Products</w:t>
             </w:r>
             <w:r>
               <w:tab/>
@@ -681,7 +681,7 @@
           </w:pPr>
           <w:hyperlink w:history="1" w:anchor="_Toc21">
             <w:r>
-              <w:t xml:space="preserve">7.4 Categories</w:t>
+              <w:t xml:space="preserve">Categories</w:t>
             </w:r>
             <w:r>
               <w:tab/>
@@ -704,7 +704,7 @@
           </w:pPr>
           <w:hyperlink w:history="1" w:anchor="_Toc22">
             <w:r>
-              <w:t xml:space="preserve">7.5 Suppliers</w:t>
+              <w:t xml:space="preserve">Suppliers</w:t>
             </w:r>
             <w:r>
               <w:tab/>
@@ -727,7 +727,7 @@
           </w:pPr>
           <w:hyperlink w:history="1" w:anchor="_Toc23">
             <w:r>
-              <w:t xml:space="preserve">7.6 Stock Movements</w:t>
+              <w:t xml:space="preserve">Stock Movements</w:t>
             </w:r>
             <w:r>
               <w:tab/>
@@ -750,7 +750,7 @@
           </w:pPr>
           <w:hyperlink w:history="1" w:anchor="_Toc24">
             <w:r>
-              <w:t xml:space="preserve">7.7 Users</w:t>
+              <w:t xml:space="preserve">Users</w:t>
             </w:r>
             <w:r>
               <w:tab/>
@@ -773,7 +773,7 @@
           </w:pPr>
           <w:hyperlink w:history="1" w:anchor="_Toc25">
             <w:r>
-              <w:t xml:space="preserve">7.8 Validation and Error Handling</w:t>
+              <w:t xml:space="preserve">Validation and Error Handling</w:t>
             </w:r>
             <w:r>
               <w:tab/>
@@ -796,7 +796,7 @@
           </w:pPr>
           <w:hyperlink w:history="1" w:anchor="_Toc26">
             <w:r>
-              <w:t xml:space="preserve">7.9 Responsive Design</w:t>
+              <w:t xml:space="preserve">Responsive Design</w:t>
             </w:r>
             <w:r>
               <w:tab/>
@@ -819,7 +819,7 @@
           </w:pPr>
           <w:hyperlink w:history="1" w:anchor="_Toc27">
             <w:r>
-              <w:t xml:space="preserve">7.10 API Endpoints</w:t>
+              <w:t xml:space="preserve">API Endpoints</w:t>
             </w:r>
             <w:r>
               <w:tab/>
@@ -842,7 +842,7 @@
           </w:pPr>
           <w:hyperlink w:history="1" w:anchor="_Toc28">
             <w:r>
-              <w:t xml:space="preserve">8. Summary and Future Work</w:t>
+              <w:t xml:space="preserve">Summary and Future Work</w:t>
             </w:r>
             <w:r>
               <w:tab/>
@@ -865,7 +865,7 @@
           </w:pPr>
           <w:hyperlink w:history="1" w:anchor="_Toc29">
             <w:r>
-              <w:t xml:space="preserve">8.1 Summary</w:t>
+              <w:t xml:space="preserve">Summary</w:t>
             </w:r>
             <w:r>
               <w:tab/>
@@ -888,7 +888,7 @@
           </w:pPr>
           <w:hyperlink w:history="1" w:anchor="_Toc30">
             <w:r>
-              <w:t xml:space="preserve">8.2 Testing and Verification</w:t>
+              <w:t xml:space="preserve">Testing and Verification</w:t>
             </w:r>
             <w:r>
               <w:tab/>
@@ -911,7 +911,7 @@
           </w:pPr>
           <w:hyperlink w:history="1" w:anchor="_Toc31">
             <w:r>
-              <w:t xml:space="preserve">8.3 Future Work</w:t>
+              <w:t xml:space="preserve">Future Work</w:t>
             </w:r>
             <w:r>
               <w:tab/>
@@ -934,7 +934,7 @@
           </w:pPr>
           <w:hyperlink w:history="1" w:anchor="_Toc32">
             <w:r>
-              <w:t xml:space="preserve">9. Sources</w:t>
+              <w:t xml:space="preserve">Sources</w:t>
             </w:r>
             <w:r>
               <w:tab/>
@@ -957,7 +957,7 @@
           </w:pPr>
           <w:hyperlink w:history="1" w:anchor="_Toc33">
             <w:r>
-              <w:t xml:space="preserve">9.1 Frameworks, Libraries and Services</w:t>
+              <w:t xml:space="preserve">Frameworks, Libraries and Services</w:t>
             </w:r>
             <w:r>
               <w:tab/>
@@ -980,7 +980,7 @@
           </w:pPr>
           <w:hyperlink w:history="1" w:anchor="_Toc34">
             <w:r>
-              <w:t xml:space="preserve">9.2 References</w:t>
+              <w:t xml:space="preserve">References</w:t>
             </w:r>
             <w:r>
               <w:tab/>
@@ -1012,7 +1012,7 @@
       </w:pPr>
       <w:bookmarkStart w:name="_Toc1" w:id="1"/>
       <w:r>
-        <w:t xml:space="preserve">1. Project Overview</w:t>
+        <w:t xml:space="preserve">Project Overview</w:t>
       </w:r>
       <w:bookmarkEnd w:id="1"/>
     </w:p>
@@ -1022,7 +1022,7 @@
       </w:pPr>
       <w:bookmarkStart w:name="_Toc2" w:id="2"/>
       <w:r>
-        <w:t xml:space="preserve">1.1 Background and Problem</w:t>
+        <w:t xml:space="preserve">Background and Problem</w:t>
       </w:r>
       <w:bookmarkEnd w:id="2"/>
     </w:p>
@@ -1060,7 +1060,7 @@
       </w:pPr>
       <w:bookmarkStart w:name="_Toc3" w:id="3"/>
       <w:r>
-        <w:t xml:space="preserve">1.2 Proposed Solution</w:t>
+        <w:t xml:space="preserve">Proposed Solution</w:t>
       </w:r>
       <w:bookmarkEnd w:id="3"/>
     </w:p>
@@ -1162,7 +1162,7 @@
       </w:pPr>
       <w:bookmarkStart w:name="_Toc4" w:id="4"/>
       <w:r>
-        <w:t xml:space="preserve">1.3 Live Deliverables</w:t>
+        <w:t xml:space="preserve">Live Deliverables</w:t>
       </w:r>
       <w:bookmarkEnd w:id="4"/>
     </w:p>
@@ -1545,7 +1545,7 @@
       </w:pPr>
       <w:bookmarkStart w:name="_Toc5" w:id="5"/>
       <w:r>
-        <w:t xml:space="preserve">2. Objectives</w:t>
+        <w:t xml:space="preserve">Objectives</w:t>
       </w:r>
       <w:bookmarkEnd w:id="5"/>
     </w:p>
@@ -1793,7 +1793,7 @@
       </w:pPr>
       <w:bookmarkStart w:name="_Toc6" w:id="6"/>
       <w:r>
-        <w:t xml:space="preserve">3. Scope and Limitations</w:t>
+        <w:t xml:space="preserve">Scope and Limitations</w:t>
       </w:r>
       <w:bookmarkEnd w:id="6"/>
     </w:p>
@@ -1803,7 +1803,7 @@
       </w:pPr>
       <w:bookmarkStart w:name="_Toc7" w:id="7"/>
       <w:r>
-        <w:t xml:space="preserve">3.1 Scope</w:t>
+        <w:t xml:space="preserve">Scope</w:t>
       </w:r>
       <w:bookmarkEnd w:id="7"/>
     </w:p>
@@ -1939,7 +1939,7 @@
       </w:pPr>
       <w:bookmarkStart w:name="_Toc8" w:id="8"/>
       <w:r>
-        <w:t xml:space="preserve">3.2 Limitations</w:t>
+        <w:t xml:space="preserve">Limitations</w:t>
       </w:r>
       <w:bookmarkEnd w:id="8"/>
     </w:p>
@@ -2093,7 +2093,7 @@
       </w:pPr>
       <w:bookmarkStart w:name="_Toc9" w:id="9"/>
       <w:r>
-        <w:t xml:space="preserve">4. System Architecture</w:t>
+        <w:t xml:space="preserve">System Architecture</w:t>
       </w:r>
       <w:bookmarkEnd w:id="9"/>
     </w:p>
@@ -2190,7 +2190,7 @@
       </w:pPr>
       <w:bookmarkStart w:name="_Toc10" w:id="10"/>
       <w:r>
-        <w:t xml:space="preserve">4.1 Presentation Tier (Client)</w:t>
+        <w:t xml:space="preserve">Presentation Tier (Client)</w:t>
       </w:r>
       <w:bookmarkEnd w:id="10"/>
     </w:p>
@@ -2214,7 +2214,7 @@
       </w:pPr>
       <w:bookmarkStart w:name="_Toc11" w:id="11"/>
       <w:r>
-        <w:t xml:space="preserve">4.2 Application Tier (REST API)</w:t>
+        <w:t xml:space="preserve">Application Tier (REST API)</w:t>
       </w:r>
       <w:bookmarkEnd w:id="11"/>
     </w:p>
@@ -2392,7 +2392,7 @@
       </w:pPr>
       <w:bookmarkStart w:name="_Toc12" w:id="12"/>
       <w:r>
-        <w:t xml:space="preserve">4.3 Data Tier (Database)</w:t>
+        <w:t xml:space="preserve">Data Tier (Database)</w:t>
       </w:r>
       <w:bookmarkEnd w:id="12"/>
     </w:p>
@@ -2407,7 +2407,7 @@
           <w:sz w:val="22"/>
           <w:szCs w:val="22"/>
         </w:rPr>
-        <w:t xml:space="preserve">MongoDB Atlas stores five collections in a database named stockwise. Mongoose schemas define the structure, validation rules, indexes and relationships of the documents, as described in Section 5.</w:t>
+        <w:t xml:space="preserve">MongoDB Atlas stores five collections in a database named stockwise. Mongoose schemas define the structure, validation rules, indexes and relationships of the documents, as described in the Database Design section.</w:t>
       </w:r>
     </w:p>
     <w:p>
@@ -2416,7 +2416,7 @@
       </w:pPr>
       <w:bookmarkStart w:name="_Toc13" w:id="13"/>
       <w:r>
-        <w:t xml:space="preserve">4.4 REST and JWT Authentication Flow</w:t>
+        <w:t xml:space="preserve">REST and JWT Authentication Flow</w:t>
       </w:r>
       <w:bookmarkEnd w:id="13"/>
     </w:p>
@@ -2516,7 +2516,7 @@
       </w:pPr>
       <w:bookmarkStart w:name="_Toc14" w:id="14"/>
       <w:r>
-        <w:t xml:space="preserve">4.5 Stock Integrity</w:t>
+        <w:t xml:space="preserve">Stock Integrity</w:t>
       </w:r>
       <w:bookmarkEnd w:id="14"/>
     </w:p>
@@ -2540,7 +2540,7 @@
       </w:pPr>
       <w:bookmarkStart w:name="_Toc15" w:id="15"/>
       <w:r>
-        <w:t xml:space="preserve">5. Database Design</w:t>
+        <w:t xml:space="preserve">Database Design</w:t>
       </w:r>
       <w:bookmarkEnd w:id="15"/>
     </w:p>
@@ -7913,7 +7913,7 @@
       </w:pPr>
       <w:bookmarkStart w:name="_Toc16" w:id="16"/>
       <w:r>
-        <w:t xml:space="preserve">6. User Interface Design</w:t>
+        <w:t xml:space="preserve">User Interface Design</w:t>
       </w:r>
       <w:bookmarkEnd w:id="16"/>
     </w:p>
@@ -9526,7 +9526,7 @@
       </w:pPr>
       <w:bookmarkStart w:name="_Toc17" w:id="17"/>
       <w:r>
-        <w:t xml:space="preserve">7. Feature List</w:t>
+        <w:t xml:space="preserve">Feature List</w:t>
       </w:r>
       <w:bookmarkEnd w:id="17"/>
     </w:p>
@@ -9536,7 +9536,7 @@
       </w:pPr>
       <w:bookmarkStart w:name="_Toc18" w:id="18"/>
       <w:r>
-        <w:t xml:space="preserve">7.1 Authentication and Roles</w:t>
+        <w:t xml:space="preserve">Authentication and Roles</w:t>
       </w:r>
       <w:bookmarkEnd w:id="18"/>
     </w:p>
@@ -9636,7 +9636,7 @@
       </w:pPr>
       <w:bookmarkStart w:name="_Toc19" w:id="19"/>
       <w:r>
-        <w:t xml:space="preserve">7.2 Dashboard</w:t>
+        <w:t xml:space="preserve">Dashboard</w:t>
       </w:r>
       <w:bookmarkEnd w:id="19"/>
     </w:p>
@@ -9718,7 +9718,7 @@
       </w:pPr>
       <w:bookmarkStart w:name="_Toc20" w:id="20"/>
       <w:r>
-        <w:t xml:space="preserve">7.3 Products</w:t>
+        <w:t xml:space="preserve">Products</w:t>
       </w:r>
       <w:bookmarkEnd w:id="20"/>
     </w:p>
@@ -9818,7 +9818,7 @@
       </w:pPr>
       <w:bookmarkStart w:name="_Toc21" w:id="21"/>
       <w:r>
-        <w:t xml:space="preserve">7.4 Categories</w:t>
+        <w:t xml:space="preserve">Categories</w:t>
       </w:r>
       <w:bookmarkEnd w:id="21"/>
     </w:p>
@@ -9882,7 +9882,7 @@
       </w:pPr>
       <w:bookmarkStart w:name="_Toc22" w:id="22"/>
       <w:r>
-        <w:t xml:space="preserve">7.5 Suppliers</w:t>
+        <w:t xml:space="preserve">Suppliers</w:t>
       </w:r>
       <w:bookmarkEnd w:id="22"/>
     </w:p>
@@ -9928,7 +9928,7 @@
       </w:pPr>
       <w:bookmarkStart w:name="_Toc23" w:id="23"/>
       <w:r>
-        <w:t xml:space="preserve">7.6 Stock Movements</w:t>
+        <w:t xml:space="preserve">Stock Movements</w:t>
       </w:r>
       <w:bookmarkEnd w:id="23"/>
     </w:p>
@@ -9992,7 +9992,7 @@
       </w:pPr>
       <w:bookmarkStart w:name="_Toc24" w:id="24"/>
       <w:r>
-        <w:t xml:space="preserve">7.7 Users</w:t>
+        <w:t xml:space="preserve">Users</w:t>
       </w:r>
       <w:bookmarkEnd w:id="24"/>
     </w:p>
@@ -10038,7 +10038,7 @@
       </w:pPr>
       <w:bookmarkStart w:name="_Toc25" w:id="25"/>
       <w:r>
-        <w:t xml:space="preserve">7.8 Validation and Error Handling</w:t>
+        <w:t xml:space="preserve">Validation and Error Handling</w:t>
       </w:r>
       <w:bookmarkEnd w:id="25"/>
     </w:p>
@@ -10120,7 +10120,7 @@
       </w:pPr>
       <w:bookmarkStart w:name="_Toc26" w:id="26"/>
       <w:r>
-        <w:t xml:space="preserve">7.9 Responsive Design</w:t>
+        <w:t xml:space="preserve">Responsive Design</w:t>
       </w:r>
       <w:bookmarkEnd w:id="26"/>
     </w:p>
@@ -10184,7 +10184,7 @@
       </w:pPr>
       <w:bookmarkStart w:name="_Toc27" w:id="27"/>
       <w:r>
-        <w:t xml:space="preserve">7.10 API Endpoints</w:t>
+        <w:t xml:space="preserve">API Endpoints</w:t>
       </w:r>
       <w:bookmarkEnd w:id="27"/>
     </w:p>
@@ -12783,7 +12783,7 @@
       </w:pPr>
       <w:bookmarkStart w:name="_Toc28" w:id="28"/>
       <w:r>
-        <w:t xml:space="preserve">8. Summary and Future Work</w:t>
+        <w:t xml:space="preserve">Summary and Future Work</w:t>
       </w:r>
       <w:bookmarkEnd w:id="28"/>
     </w:p>
@@ -12793,7 +12793,7 @@
       </w:pPr>
       <w:bookmarkStart w:name="_Toc29" w:id="29"/>
       <w:r>
-        <w:t xml:space="preserve">8.1 Summary</w:t>
+        <w:t xml:space="preserve">Summary</w:t>
       </w:r>
       <w:bookmarkEnd w:id="29"/>
     </w:p>
@@ -12831,7 +12831,7 @@
       </w:pPr>
       <w:bookmarkStart w:name="_Toc30" w:id="30"/>
       <w:r>
-        <w:t xml:space="preserve">8.2 Testing and Verification</w:t>
+        <w:t xml:space="preserve">Testing and Verification</w:t>
       </w:r>
       <w:bookmarkEnd w:id="30"/>
     </w:p>
@@ -12925,7 +12925,7 @@
       </w:pPr>
       <w:bookmarkStart w:name="_Toc31" w:id="31"/>
       <w:r>
-        <w:t xml:space="preserve">8.3 Future Work</w:t>
+        <w:t xml:space="preserve">Future Work</w:t>
       </w:r>
       <w:bookmarkEnd w:id="31"/>
     </w:p>
@@ -13104,7 +13104,7 @@
       </w:pPr>
       <w:bookmarkStart w:name="_Toc32" w:id="32"/>
       <w:r>
-        <w:t xml:space="preserve">9. Sources</w:t>
+        <w:t xml:space="preserve">Sources</w:t>
       </w:r>
       <w:bookmarkEnd w:id="32"/>
     </w:p>
@@ -13114,7 +13114,7 @@
       </w:pPr>
       <w:bookmarkStart w:name="_Toc33" w:id="33"/>
       <w:r>
-        <w:t xml:space="preserve">9.1 Frameworks, Libraries and Services</w:t>
+        <w:t xml:space="preserve">Frameworks, Libraries and Services</w:t>
       </w:r>
       <w:bookmarkEnd w:id="33"/>
     </w:p>
@@ -14096,7 +14096,7 @@
       </w:pPr>
       <w:bookmarkStart w:name="_Toc34" w:id="34"/>
       <w:r>
-        <w:t xml:space="preserve">9.2 References</w:t>
+        <w:t xml:space="preserve">References</w:t>
       </w:r>
       <w:bookmarkEnd w:id="34"/>
     </w:p>

</xml_diff>